<commit_message>
Update résumé PDF/docx to trimmed one-page version
Co-Authored-By: Claude Fable 5 <noreply@anthropic.com>
</commit_message>
<xml_diff>
--- a/Adam Hickey – Lead Product Designer.docx
+++ b/Adam Hickey – Lead Product Designer.docx
@@ -195,7 +195,25 @@
           <w:sz w:val="18"/>
           <w:szCs w:val="18"/>
         </w:rPr>
-        <w:t>RBA Inc – Lead UX Product Designer (2013 – Present)</w:t>
+        <w:t xml:space="preserve">RBA Inc </w:t>
+      </w:r>
+      <w:r>
+        <w:rPr>
+          <w:b/>
+          <w:bCs/>
+          <w:sz w:val="16"/>
+          <w:szCs w:val="16"/>
+        </w:rPr>
+        <w:t xml:space="preserve">— </w:t>
+      </w:r>
+      <w:r>
+        <w:rPr>
+          <w:b/>
+          <w:bCs/>
+          <w:sz w:val="18"/>
+          <w:szCs w:val="18"/>
+        </w:rPr>
+        <w:t>Lead UX Product Designer (2013 – Present)</w:t>
       </w:r>
     </w:p>
     <w:p>
@@ -1308,6 +1326,7 @@
   <w:style w:type="character" w:default="1" w:styleId="DefaultParagraphFont">
     <w:name w:val="Default Paragraph Font"/>
     <w:uiPriority w:val="1"/>
+    <w:semiHidden/>
     <w:unhideWhenUsed/>
   </w:style>
   <w:style w:type="table" w:default="1" w:styleId="TableNormal">

</xml_diff>

<commit_message>
Match the resume copy to the site's plain-language pass
Same treatment as the case studies, applied lightly. The summary's
"scale better design" and "build and steward the systems that help
teams ship consistent, measurable outcomes" said very little; the
bullets leaned on "align experience with measurable outcomes" and
"multiply the design system."

Kept every hard keyword (design systems, governance, DesignOps,
accessibility, WCAG 2.1 AA, SAP Fiori, drift audits) since recruiters
and ATS screens read for those. Regenerated the PDF from the edited
docx via the same LibreOffice export that produced the original, and
it still fits on one page with the same line breaks.

Co-Authored-By: Claude Opus 5 <noreply@anthropic.com>
</commit_message>
<xml_diff>
--- a/Adam Hickey – Lead Product Designer.docx
+++ b/Adam Hickey – Lead Product Designer.docx
@@ -98,19 +98,8 @@
             <w:szCs w:val="16"/>
             <w:u w:val="single"/>
           </w:rPr>
-          <w:t>linkedin.com/in/</w:t>
+          <w:t>linkedin.com/in/adamdhickey</w:t>
         </w:r>
-        <w:proofErr w:type="spellStart"/>
-        <w:r>
-          <w:rPr>
-            <w:color w:val="1155CC"/>
-            <w:sz w:val="16"/>
-            <w:szCs w:val="16"/>
-            <w:u w:val="single"/>
-          </w:rPr>
-          <w:t>adamdhickey</w:t>
-        </w:r>
-        <w:proofErr w:type="spellEnd"/>
       </w:hyperlink>
     </w:p>
     <w:p>
@@ -156,7 +145,7 @@
           <w:sz w:val="16"/>
           <w:szCs w:val="16"/>
         </w:rPr>
-        <w:t>Lead product designer with 20 years of experience helping global organizations like Cargill, Intel, and Toro scale better design through design systems, governance, accessibility, and AI-assisted workflows. I build and steward the systems that help product, engineering, and business teams ship consistent, measurable outcomes. Known for using AI to multiply the design system rather than just my own output, with the judgment calls staying human.</w:t>
+        <w:t>Lead product designer with 20 years of experience helping global organizations like Cargill, Intel, and Toro make dozens of products feel like one, through design systems, governance, accessibility, and AI-assisted workflows. I build the system and then keep it healthy, so product, engineering, and business teams ship consistent work the business can measure. I use AI to scale the design system, not just my own output. The judgment calls stay human.</w:t>
       </w:r>
     </w:p>
     <w:p>
@@ -253,7 +242,7 @@
           <w:sz w:val="16"/>
           <w:szCs w:val="16"/>
         </w:rPr>
-        <w:t>Partner with product, engineering, and business teams to align experience with measurable outcomes: efficiency, adoption, quality, and ROI.</w:t>
+        <w:t>Work with product, engineering, and business teams so design decisions show up in the numbers they already track: efficiency, adoption, quality, and ROI.</w:t>
       </w:r>
     </w:p>
     <w:p>
@@ -293,7 +282,7 @@
           <w:sz w:val="16"/>
           <w:szCs w:val="16"/>
         </w:rPr>
-        <w:t>Use AI to multiply the design system. Documentation drafts, drift audits, design-to-code alignment checks, and research synthesis, with human judgment on every decision.</w:t>
+        <w:t>Use AI to scale the design system. Drafting documentation, auditing for drift, checking design against code, and pulling research together, with human judgment on every decision.</w:t>
       </w:r>
     </w:p>
     <w:p>
@@ -313,23 +302,7 @@
           <w:sz w:val="16"/>
           <w:szCs w:val="16"/>
         </w:rPr>
-        <w:t xml:space="preserve">Lead accessibility, </w:t>
-      </w:r>
-      <w:proofErr w:type="spellStart"/>
-      <w:r>
-        <w:rPr>
-          <w:sz w:val="16"/>
-          <w:szCs w:val="16"/>
-        </w:rPr>
-        <w:t>DesignOps</w:t>
-      </w:r>
-      <w:proofErr w:type="spellEnd"/>
-      <w:r>
-        <w:rPr>
-          <w:sz w:val="16"/>
-          <w:szCs w:val="16"/>
-        </w:rPr>
-        <w:t>, and governance practices; mentor designers on using AI with the design system without lowering standards.</w:t>
+        <w:t xml:space="preserve">Lead accessibility, DesignOps, and governance practices, and mentor designers on using AI with the design system without dropping the standards.</w:t>
       </w:r>
     </w:p>
     <w:p>
@@ -481,23 +454,7 @@
           <w:sz w:val="16"/>
           <w:szCs w:val="16"/>
         </w:rPr>
-        <w:t>Figma/</w:t>
-      </w:r>
-      <w:proofErr w:type="spellStart"/>
-      <w:r>
-        <w:rPr>
-          <w:sz w:val="16"/>
-          <w:szCs w:val="16"/>
-        </w:rPr>
-        <w:t>FigJam</w:t>
-      </w:r>
-      <w:proofErr w:type="spellEnd"/>
-      <w:r>
-        <w:rPr>
-          <w:sz w:val="16"/>
-          <w:szCs w:val="16"/>
-        </w:rPr>
-        <w:t xml:space="preserve"> • Adobe Creative Suite • Claude Code • Gemini • ChatGPT • Sitecore • Umbraco • SAP Fiori • SharePoint • Power Apps • Power BI • Google Analytics • Accessibility (WCAG 2.1 AA, screen readers, keyboard navigation)</w:t>
+        <w:t xml:space="preserve">Figma/FigJam • Adobe Creative Suite • Claude Code • Gemini • ChatGPT • Sitecore • Umbraco • SAP Fiori • SharePoint • Power Apps • Power BI • Google Analytics • Accessibility (WCAG 2.1 AA, screen readers, keyboard navigation)</w:t>
       </w:r>
     </w:p>
     <w:p>
@@ -633,7 +590,7 @@
           <w:sz w:val="16"/>
           <w:szCs w:val="16"/>
         </w:rPr>
-        <w:t>Led rebranding initiatives and developed complete visual identity systems.</w:t>
+        <w:t>Led rebrands and built complete visual identity systems.</w:t>
       </w:r>
     </w:p>
     <w:p>
@@ -678,7 +635,6 @@
       <w:pPr>
         <w:spacing w:after="100" w:line="264" w:lineRule="auto"/>
       </w:pPr>
-      <w:proofErr w:type="spellStart"/>
       <w:r>
         <w:rPr>
           <w:b/>
@@ -686,17 +642,7 @@
           <w:sz w:val="16"/>
           <w:szCs w:val="16"/>
         </w:rPr>
-        <w:t>ByDesign</w:t>
-      </w:r>
-      <w:proofErr w:type="spellEnd"/>
-      <w:r>
-        <w:rPr>
-          <w:b/>
-          <w:bCs/>
-          <w:sz w:val="16"/>
-          <w:szCs w:val="16"/>
-        </w:rPr>
-        <w:t xml:space="preserve"> — Graphic Designer (Jan 2005 – Jan 2006)</w:t>
+        <w:t xml:space="preserve">ByDesign — Graphic Designer (Jan 2005 – Jan 2006)</w:t>
       </w:r>
     </w:p>
     <w:p>

</xml_diff>